<commit_message>
Added Matthew's version of project brief to document
</commit_message>
<xml_diff>
--- a/Checkpoint 1/Project_brief.docx
+++ b/Checkpoint 1/Project_brief.docx
@@ -3,46 +3,323 @@
 <w:document xmlns:wpc="http://schemas.microsoft.com/office/word/2010/wordprocessingCanvas" xmlns:cx="http://schemas.microsoft.com/office/drawing/2014/chartex" xmlns:cx1="http://schemas.microsoft.com/office/drawing/2015/9/8/chartex" xmlns:cx2="http://schemas.microsoft.com/office/drawing/2015/10/21/chartex" xmlns:cx3="http://schemas.microsoft.com/office/drawing/2016/5/9/chartex" xmlns:cx4="http://schemas.microsoft.com/office/drawing/2016/5/10/chartex" xmlns:cx5="http://schemas.microsoft.com/office/drawing/2016/5/11/chartex" xmlns:cx6="http://schemas.microsoft.com/office/drawing/2016/5/12/chartex" xmlns:cx7="http://schemas.microsoft.com/office/drawing/2016/5/13/chartex" xmlns:cx8="http://schemas.microsoft.com/office/drawing/2016/5/14/chartex" xmlns:mc="http://schemas.openxmlformats.org/markup-compatibility/2006" xmlns:aink="http://schemas.microsoft.com/office/drawing/2016/ink" xmlns:am3d="http://schemas.microsoft.com/office/drawing/2017/model3d" xmlns:o="urn:schemas-microsoft-com:office:office" xmlns:oel="http://schemas.microsoft.com/office/2019/extlst" xmlns:r="http://schemas.openxmlformats.org/officeDocument/2006/relationships" xmlns:m="http://schemas.openxmlformats.org/officeDocument/2006/math" xmlns:v="urn:schemas-microsoft-com:vml" xmlns:wp14="http://schemas.microsoft.com/office/word/2010/wordprocessingDrawing" xmlns:wp="http://schemas.openxmlformats.org/drawingml/2006/wordprocessingDrawing" xmlns:w10="urn:schemas-microsoft-com:office:word" xmlns:w="http://schemas.openxmlformats.org/wordprocessingml/2006/main" xmlns:w14="http://schemas.microsoft.com/office/word/2010/wordml" xmlns:w15="http://schemas.microsoft.com/office/word/2012/wordml" xmlns:w16cex="http://schemas.microsoft.com/office/word/2018/wordml/cex" xmlns:w16cid="http://schemas.microsoft.com/office/word/2016/wordml/cid" xmlns:w16="http://schemas.microsoft.com/office/word/2018/wordml" xmlns:w16du="http://schemas.microsoft.com/office/word/2023/wordml/word16du" xmlns:w16sdtdh="http://schemas.microsoft.com/office/word/2020/wordml/sdtdatahash" xmlns:w16sdtfl="http://schemas.microsoft.com/office/word/2024/wordml/sdtformatlock" xmlns:w16se="http://schemas.microsoft.com/office/word/2015/wordml/symex" xmlns:wpg="http://schemas.microsoft.com/office/word/2010/wordprocessingGroup" xmlns:wpi="http://schemas.microsoft.com/office/word/2010/wordprocessingInk" xmlns:wne="http://schemas.microsoft.com/office/word/2006/wordml" xmlns:wps="http://schemas.microsoft.com/office/word/2010/wordprocessingShape" mc:Ignorable="w14 w15 w16se w16cid w16 w16cex w16sdtdh w16sdtfl w16du wp14">
   <w:body>
     <w:p>
-      <w:r>
+      <w:pPr>
+        <w:rPr>
+          <w:lang w:val="en-US"/>
+        </w:rPr>
+      </w:pPr>
+      <w:r>
+        <w:rPr>
+          <w:lang w:val="en-US"/>
+        </w:rPr>
         <w:t xml:space="preserve">Rough Draft: </w:t>
       </w:r>
     </w:p>
     <w:p>
-      <w:r>
-        <w:t xml:space="preserve">To encourage primary school children learning with new technology, the application Farmer Fred’s Trivia will include the use of a farm setting to provide children with genre specific trivia questions/challenges encouraging agricultural/farming learning in a gamified manner. Each user will have their own specific profile tracking their learning progress across different genres. </w:t>
-      </w:r>
-      <w:r>
-        <w:t>Each category will be accessed via different characters</w:t>
-      </w:r>
-      <w:r>
-        <w:t>/avatars/sprites</w:t>
-      </w:r>
-      <w:r>
-        <w:t xml:space="preserve"> that develop</w:t>
-      </w:r>
-      <w:r>
-        <w:t xml:space="preserve"> and change appearance</w:t>
-      </w:r>
-      <w:r>
-        <w:t xml:space="preserve"> as the user advances through the levels</w:t>
-      </w:r>
-      <w:r>
-        <w:t xml:space="preserve">, with increasing difficulty of the related trivia questions, finally reaching the fully developed farm. </w:t>
-      </w:r>
-    </w:p>
-    <w:p/>
-    <w:p/>
-    <w:p>
-      <w:r>
-        <w:t xml:space="preserve">Reworded slightly??: </w:t>
+      <w:pPr>
+        <w:rPr>
+          <w:lang w:val="en-US"/>
+        </w:rPr>
+      </w:pPr>
+      <w:r>
+        <w:rPr>
+          <w:lang w:val="en-US"/>
+        </w:rPr>
+        <w:t xml:space="preserve">To encourage primary school children learning with new technology, the application Farmer Fred’s Trivia will include the use of a farm setting to provide children with genre specific trivia questions/challenges encouraging agricultural/farming learning in a gamified manner. Each user will have their own specific profile tracking their learning progress across different genres. Each category will be accessed via different characters/avatars/sprites that develop and change appearance as the user advances through the levels, with increasing difficulty of the related trivia questions, finally reaching the fully developed farm. </w:t>
       </w:r>
     </w:p>
     <w:p>
-      <w:r>
-        <w:t>Farmer Fred’s Trivia is an interactive educational application designed to support and encourage primary school students in learning about agriculture through gamified trivia questions. Set within a dynamic farm environment, users progress by answering subject-specific questions, allowing them to grow and develop their own personalised farm. Each category is represented by unique farm elements (e.g., crops, animals, etc), which evolve visually as the user advances, reinforcing learning through progression and fun. Unlike traditional trivia or educational apps, Framer Fred’s Trivia visualises the learning process as a growing farm ecosystem, allowing students to not only learn through the trivia questions but also through the layout of the app itself, where the development of the environment directly correlates to the advancement of levels.</w:t>
-      </w:r>
+      <w:pPr>
+        <w:rPr>
+          <w:lang w:val="en-US"/>
+        </w:rPr>
+      </w:pPr>
     </w:p>
-    <w:p/>
+    <w:p>
+      <w:pPr>
+        <w:rPr>
+          <w:lang w:val="en-US"/>
+        </w:rPr>
+      </w:pPr>
+    </w:p>
+    <w:p>
+      <w:pPr>
+        <w:rPr>
+          <w:lang w:val="en-US"/>
+        </w:rPr>
+      </w:pPr>
+      <w:r>
+        <w:rPr>
+          <w:lang w:val="en-US"/>
+        </w:rPr>
+        <w:t xml:space="preserve">Reworded slightly??: </w:t>
+      </w:r>
+    </w:p>
+    <w:p>
+      <w:pPr>
+        <w:rPr>
+          <w:lang w:val="en-US"/>
+        </w:rPr>
+      </w:pPr>
+      <w:r>
+        <w:rPr>
+          <w:lang w:val="en-US"/>
+        </w:rPr>
+        <w:t xml:space="preserve">Farmer Fred’s Trivia is an interactive educational application designed to support and encourage primary school students in learning about agriculture through gamified trivia questions. Set within a dynamic farm environment, users progress by answering subject-specific questions, allowing them to grow and develop their own </w:t>
+      </w:r>
+      <w:proofErr w:type="spellStart"/>
+      <w:r>
+        <w:rPr>
+          <w:lang w:val="en-US"/>
+        </w:rPr>
+        <w:t>personalised</w:t>
+      </w:r>
+      <w:proofErr w:type="spellEnd"/>
+      <w:r>
+        <w:rPr>
+          <w:lang w:val="en-US"/>
+        </w:rPr>
+        <w:t xml:space="preserve"> farm. Each category is represented by unique farm elements (e.g., crops, animals, </w:t>
+      </w:r>
+      <w:proofErr w:type="spellStart"/>
+      <w:r>
+        <w:rPr>
+          <w:lang w:val="en-US"/>
+        </w:rPr>
+        <w:t>etc</w:t>
+      </w:r>
+      <w:proofErr w:type="spellEnd"/>
+      <w:r>
+        <w:rPr>
+          <w:lang w:val="en-US"/>
+        </w:rPr>
+        <w:t xml:space="preserve">), which evolve visually as the user advances, reinforcing learning through progression and fun. Unlike traditional trivia or educational apps, Framer Fred’s Trivia </w:t>
+      </w:r>
+      <w:proofErr w:type="spellStart"/>
+      <w:r>
+        <w:rPr>
+          <w:lang w:val="en-US"/>
+        </w:rPr>
+        <w:t>visualises</w:t>
+      </w:r>
+      <w:proofErr w:type="spellEnd"/>
+      <w:r>
+        <w:rPr>
+          <w:lang w:val="en-US"/>
+        </w:rPr>
+        <w:t xml:space="preserve"> the learning process as a growing farm ecosystem, allowing students to not only learn through the trivia questions but also through the layout of the app itself, where the development of the environment directly correlates to the advancement of levels.</w:t>
+      </w:r>
+    </w:p>
+    <w:p>
+      <w:pPr>
+        <w:rPr>
+          <w:lang w:val="en-US"/>
+        </w:rPr>
+      </w:pPr>
+    </w:p>
+    <w:p>
+      <w:pPr>
+        <w:rPr>
+          <w:lang w:val="en-US"/>
+        </w:rPr>
+      </w:pPr>
+      <w:r>
+        <w:rPr>
+          <w:lang w:val="en-US"/>
+        </w:rPr>
+        <w:t>Matthew-</w:t>
+      </w:r>
+    </w:p>
+    <w:p>
+      <w:r>
+        <w:rPr>
+          <w:lang w:val="en-US"/>
+        </w:rPr>
+        <w:t>Farmer Fred’s Trivia is an interactive educational appli</w:t>
+      </w:r>
+      <w:r>
+        <w:rPr>
+          <w:lang w:val="en-US"/>
+        </w:rPr>
+        <w:t xml:space="preserve">cation designed for primary school students. The application aims to educate young learners about agriculture and environmental </w:t>
+      </w:r>
+      <w:r>
+        <w:rPr>
+          <w:lang w:val="en-US"/>
+        </w:rPr>
+        <w:t>themes</w:t>
+      </w:r>
+      <w:r>
+        <w:rPr>
+          <w:lang w:val="en-US"/>
+        </w:rPr>
+        <w:t xml:space="preserve"> through gamified trivia questions</w:t>
+      </w:r>
+      <w:r>
+        <w:rPr>
+          <w:lang w:val="en-US"/>
+        </w:rPr>
+        <w:t xml:space="preserve">, with a dynamic farm scene acting as the progress indicator and reward system. </w:t>
+      </w:r>
+      <w:r>
+        <w:rPr>
+          <w:lang w:val="en-US"/>
+        </w:rPr>
+        <w:t>Players are</w:t>
+      </w:r>
+      <w:r>
+        <w:rPr>
+          <w:lang w:val="en-US"/>
+        </w:rPr>
+        <w:t xml:space="preserve"> encouraged to grow and develop the </w:t>
+      </w:r>
+      <w:r>
+        <w:rPr>
+          <w:lang w:val="en-US"/>
+        </w:rPr>
+        <w:t>land</w:t>
+      </w:r>
+      <w:r>
+        <w:rPr>
+          <w:lang w:val="en-US"/>
+        </w:rPr>
+        <w:t xml:space="preserve"> (and its unique characters) i</w:t>
+      </w:r>
+      <w:r>
+        <w:rPr>
+          <w:lang w:val="en-US"/>
+        </w:rPr>
+        <w:t xml:space="preserve">nto </w:t>
+      </w:r>
+      <w:r>
+        <w:rPr>
+          <w:lang w:val="en-US"/>
+        </w:rPr>
+        <w:t xml:space="preserve">an </w:t>
+      </w:r>
+      <w:r>
+        <w:rPr>
+          <w:lang w:val="en-US"/>
+        </w:rPr>
+        <w:t>environmentally thriving and rewarding</w:t>
+      </w:r>
+      <w:r>
+        <w:rPr>
+          <w:lang w:val="en-US"/>
+        </w:rPr>
+        <w:t xml:space="preserve"> farm</w:t>
+      </w:r>
+      <w:r>
+        <w:rPr>
+          <w:lang w:val="en-US"/>
+        </w:rPr>
+        <w:t xml:space="preserve">, </w:t>
+      </w:r>
+      <w:r>
+        <w:rPr>
+          <w:lang w:val="en-US"/>
+        </w:rPr>
+        <w:t>providing</w:t>
+      </w:r>
+      <w:r>
+        <w:rPr>
+          <w:lang w:val="en-US"/>
+        </w:rPr>
+        <w:t xml:space="preserve"> a satisfying motive</w:t>
+      </w:r>
+      <w:r>
+        <w:rPr>
+          <w:lang w:val="en-US"/>
+        </w:rPr>
+        <w:t xml:space="preserve"> that </w:t>
+      </w:r>
+      <w:r>
+        <w:rPr>
+          <w:lang w:val="en-US"/>
+        </w:rPr>
+        <w:t>complements</w:t>
+      </w:r>
+      <w:r>
+        <w:rPr>
+          <w:lang w:val="en-US"/>
+        </w:rPr>
+        <w:t xml:space="preserve"> </w:t>
+      </w:r>
+      <w:r>
+        <w:rPr>
+          <w:lang w:val="en-US"/>
+        </w:rPr>
+        <w:t xml:space="preserve">educational learning.  </w:t>
+      </w:r>
+      <w:r>
+        <w:rPr>
+          <w:lang w:val="en-US"/>
+        </w:rPr>
+        <w:t>Unlike traditional trivia or educational apps, Fa</w:t>
+      </w:r>
+      <w:r>
+        <w:rPr>
+          <w:lang w:val="en-US"/>
+        </w:rPr>
+        <w:t>r</w:t>
+      </w:r>
+      <w:r>
+        <w:rPr>
+          <w:lang w:val="en-US"/>
+        </w:rPr>
+        <w:t xml:space="preserve">mer Fred’s Trivia </w:t>
+      </w:r>
+      <w:proofErr w:type="spellStart"/>
+      <w:r>
+        <w:rPr>
+          <w:lang w:val="en-US"/>
+        </w:rPr>
+        <w:t>visualises</w:t>
+      </w:r>
+      <w:proofErr w:type="spellEnd"/>
+      <w:r>
+        <w:rPr>
+          <w:lang w:val="en-US"/>
+        </w:rPr>
+        <w:t xml:space="preserve"> the learning process</w:t>
+      </w:r>
+      <w:r>
+        <w:rPr>
+          <w:lang w:val="en-US"/>
+        </w:rPr>
+        <w:t>, which strengthens younger players’ connections to</w:t>
+      </w:r>
+      <w:r>
+        <w:rPr>
+          <w:lang w:val="en-US"/>
+        </w:rPr>
+        <w:t>wards</w:t>
+      </w:r>
+      <w:r>
+        <w:rPr>
+          <w:lang w:val="en-US"/>
+        </w:rPr>
+        <w:t xml:space="preserve"> healthy environmental </w:t>
+      </w:r>
+      <w:r>
+        <w:rPr>
+          <w:lang w:val="en-US"/>
+        </w:rPr>
+        <w:t>practices</w:t>
+      </w:r>
+      <w:r>
+        <w:rPr>
+          <w:lang w:val="en-US"/>
+        </w:rPr>
+        <w:t xml:space="preserve"> and decisions</w:t>
+      </w:r>
+      <w:r>
+        <w:rPr>
+          <w:lang w:val="en-US"/>
+        </w:rPr>
+        <w:t xml:space="preserve">. </w:t>
+      </w:r>
+    </w:p>
     <w:sectPr>
       <w:pgSz w:w="11906" w:h="16838"/>
       <w:pgMar w:top="1440" w:right="1440" w:bottom="1440" w:left="1440" w:header="708" w:footer="708" w:gutter="0"/>
@@ -51,126 +328,6 @@
     </w:sectPr>
   </w:body>
 </w:document>
-</file>
-
-<file path=word/numbering.xml><?xml version="1.0" encoding="utf-8"?>
-<w:numbering xmlns:wpc="http://schemas.microsoft.com/office/word/2010/wordprocessingCanvas" xmlns:cx="http://schemas.microsoft.com/office/drawing/2014/chartex" xmlns:cx1="http://schemas.microsoft.com/office/drawing/2015/9/8/chartex" xmlns:cx2="http://schemas.microsoft.com/office/drawing/2015/10/21/chartex" xmlns:cx3="http://schemas.microsoft.com/office/drawing/2016/5/9/chartex" xmlns:cx4="http://schemas.microsoft.com/office/drawing/2016/5/10/chartex" xmlns:cx5="http://schemas.microsoft.com/office/drawing/2016/5/11/chartex" xmlns:cx6="http://schemas.microsoft.com/office/drawing/2016/5/12/chartex" xmlns:cx7="http://schemas.microsoft.com/office/drawing/2016/5/13/chartex" xmlns:cx8="http://schemas.microsoft.com/office/drawing/2016/5/14/chartex" xmlns:mc="http://schemas.openxmlformats.org/markup-compatibility/2006" xmlns:aink="http://schemas.microsoft.com/office/drawing/2016/ink" xmlns:am3d="http://schemas.microsoft.com/office/drawing/2017/model3d" xmlns:o="urn:schemas-microsoft-com:office:office" xmlns:oel="http://schemas.microsoft.com/office/2019/extlst" xmlns:r="http://schemas.openxmlformats.org/officeDocument/2006/relationships" xmlns:m="http://schemas.openxmlformats.org/officeDocument/2006/math" xmlns:v="urn:schemas-microsoft-com:vml" xmlns:wp14="http://schemas.microsoft.com/office/word/2010/wordprocessingDrawing" xmlns:wp="http://schemas.openxmlformats.org/drawingml/2006/wordprocessingDrawing" xmlns:w10="urn:schemas-microsoft-com:office:word" xmlns:w="http://schemas.openxmlformats.org/wordprocessingml/2006/main" xmlns:w14="http://schemas.microsoft.com/office/word/2010/wordml" xmlns:w15="http://schemas.microsoft.com/office/word/2012/wordml" xmlns:w16cex="http://schemas.microsoft.com/office/word/2018/wordml/cex" xmlns:w16cid="http://schemas.microsoft.com/office/word/2016/wordml/cid" xmlns:w16="http://schemas.microsoft.com/office/word/2018/wordml" xmlns:w16du="http://schemas.microsoft.com/office/word/2023/wordml/word16du" xmlns:w16sdtdh="http://schemas.microsoft.com/office/word/2020/wordml/sdtdatahash" xmlns:w16sdtfl="http://schemas.microsoft.com/office/word/2024/wordml/sdtformatlock" xmlns:w16se="http://schemas.microsoft.com/office/word/2015/wordml/symex" xmlns:wpg="http://schemas.microsoft.com/office/word/2010/wordprocessingGroup" xmlns:wpi="http://schemas.microsoft.com/office/word/2010/wordprocessingInk" xmlns:wne="http://schemas.microsoft.com/office/word/2006/wordml" xmlns:wps="http://schemas.microsoft.com/office/word/2010/wordprocessingShape" mc:Ignorable="w14 w15 w16se w16cid w16 w16cex w16sdtdh w16sdtfl w16du wp14">
-  <w:abstractNum w:abstractNumId="0" w15:restartNumberingAfterBreak="0">
-    <w:nsid w:val="5DF70961"/>
-    <w:multiLevelType w:val="hybridMultilevel"/>
-    <w:tmpl w:val="2E70068C"/>
-    <w:lvl w:ilvl="0" w:tplc="9A7E7800">
-      <w:numFmt w:val="bullet"/>
-      <w:lvlText w:val="-"/>
-      <w:lvlJc w:val="left"/>
-      <w:pPr>
-        <w:ind w:left="720" w:hanging="360"/>
-      </w:pPr>
-      <w:rPr>
-        <w:rFonts w:ascii="Calibri" w:eastAsiaTheme="minorHAnsi" w:hAnsi="Calibri" w:cs="Calibri" w:hint="default"/>
-      </w:rPr>
-    </w:lvl>
-    <w:lvl w:ilvl="1" w:tplc="0C090003" w:tentative="1">
-      <w:start w:val="1"/>
-      <w:numFmt w:val="bullet"/>
-      <w:lvlText w:val="o"/>
-      <w:lvlJc w:val="left"/>
-      <w:pPr>
-        <w:ind w:left="1440" w:hanging="360"/>
-      </w:pPr>
-      <w:rPr>
-        <w:rFonts w:ascii="Courier New" w:hAnsi="Courier New" w:cs="Courier New" w:hint="default"/>
-      </w:rPr>
-    </w:lvl>
-    <w:lvl w:ilvl="2" w:tplc="0C090005" w:tentative="1">
-      <w:start w:val="1"/>
-      <w:numFmt w:val="bullet"/>
-      <w:lvlText w:val=""/>
-      <w:lvlJc w:val="left"/>
-      <w:pPr>
-        <w:ind w:left="2160" w:hanging="360"/>
-      </w:pPr>
-      <w:rPr>
-        <w:rFonts w:ascii="Wingdings" w:hAnsi="Wingdings" w:hint="default"/>
-      </w:rPr>
-    </w:lvl>
-    <w:lvl w:ilvl="3" w:tplc="0C090001" w:tentative="1">
-      <w:start w:val="1"/>
-      <w:numFmt w:val="bullet"/>
-      <w:lvlText w:val=""/>
-      <w:lvlJc w:val="left"/>
-      <w:pPr>
-        <w:ind w:left="2880" w:hanging="360"/>
-      </w:pPr>
-      <w:rPr>
-        <w:rFonts w:ascii="Symbol" w:hAnsi="Symbol" w:hint="default"/>
-      </w:rPr>
-    </w:lvl>
-    <w:lvl w:ilvl="4" w:tplc="0C090003" w:tentative="1">
-      <w:start w:val="1"/>
-      <w:numFmt w:val="bullet"/>
-      <w:lvlText w:val="o"/>
-      <w:lvlJc w:val="left"/>
-      <w:pPr>
-        <w:ind w:left="3600" w:hanging="360"/>
-      </w:pPr>
-      <w:rPr>
-        <w:rFonts w:ascii="Courier New" w:hAnsi="Courier New" w:cs="Courier New" w:hint="default"/>
-      </w:rPr>
-    </w:lvl>
-    <w:lvl w:ilvl="5" w:tplc="0C090005" w:tentative="1">
-      <w:start w:val="1"/>
-      <w:numFmt w:val="bullet"/>
-      <w:lvlText w:val=""/>
-      <w:lvlJc w:val="left"/>
-      <w:pPr>
-        <w:ind w:left="4320" w:hanging="360"/>
-      </w:pPr>
-      <w:rPr>
-        <w:rFonts w:ascii="Wingdings" w:hAnsi="Wingdings" w:hint="default"/>
-      </w:rPr>
-    </w:lvl>
-    <w:lvl w:ilvl="6" w:tplc="0C090001" w:tentative="1">
-      <w:start w:val="1"/>
-      <w:numFmt w:val="bullet"/>
-      <w:lvlText w:val=""/>
-      <w:lvlJc w:val="left"/>
-      <w:pPr>
-        <w:ind w:left="5040" w:hanging="360"/>
-      </w:pPr>
-      <w:rPr>
-        <w:rFonts w:ascii="Symbol" w:hAnsi="Symbol" w:hint="default"/>
-      </w:rPr>
-    </w:lvl>
-    <w:lvl w:ilvl="7" w:tplc="0C090003" w:tentative="1">
-      <w:start w:val="1"/>
-      <w:numFmt w:val="bullet"/>
-      <w:lvlText w:val="o"/>
-      <w:lvlJc w:val="left"/>
-      <w:pPr>
-        <w:ind w:left="5760" w:hanging="360"/>
-      </w:pPr>
-      <w:rPr>
-        <w:rFonts w:ascii="Courier New" w:hAnsi="Courier New" w:cs="Courier New" w:hint="default"/>
-      </w:rPr>
-    </w:lvl>
-    <w:lvl w:ilvl="8" w:tplc="0C090005" w:tentative="1">
-      <w:start w:val="1"/>
-      <w:numFmt w:val="bullet"/>
-      <w:lvlText w:val=""/>
-      <w:lvlJc w:val="left"/>
-      <w:pPr>
-        <w:ind w:left="6480" w:hanging="360"/>
-      </w:pPr>
-      <w:rPr>
-        <w:rFonts w:ascii="Wingdings" w:hAnsi="Wingdings" w:hint="default"/>
-      </w:rPr>
-    </w:lvl>
-  </w:abstractNum>
-  <w:num w:numId="1" w16cid:durableId="1827503988">
-    <w:abstractNumId w:val="0"/>
-  </w:num>
-</w:numbering>
 </file>
 
 <file path=word/styles.xml><?xml version="1.0" encoding="utf-8"?>
@@ -573,7 +730,6 @@
   <w:style w:type="paragraph" w:default="1" w:styleId="Normal">
     <w:name w:val="Normal"/>
     <w:qFormat/>
-    <w:rsid w:val="00677CAD"/>
   </w:style>
   <w:style w:type="paragraph" w:styleId="Heading1">
     <w:name w:val="heading 1"/>
@@ -582,7 +738,7 @@
     <w:link w:val="Heading1Char"/>
     <w:uiPriority w:val="9"/>
     <w:qFormat/>
-    <w:rsid w:val="00C53B95"/>
+    <w:rsid w:val="00A37D5B"/>
     <w:pPr>
       <w:keepNext/>
       <w:keepLines/>
@@ -591,7 +747,7 @@
     </w:pPr>
     <w:rPr>
       <w:rFonts w:asciiTheme="majorHAnsi" w:eastAsiaTheme="majorEastAsia" w:hAnsiTheme="majorHAnsi" w:cstheme="majorBidi"/>
-      <w:color w:val="2F5496" w:themeColor="accent1" w:themeShade="BF"/>
+      <w:color w:val="0F4761" w:themeColor="accent1" w:themeShade="BF"/>
       <w:sz w:val="40"/>
       <w:szCs w:val="40"/>
     </w:rPr>
@@ -605,7 +761,7 @@
     <w:semiHidden/>
     <w:unhideWhenUsed/>
     <w:qFormat/>
-    <w:rsid w:val="00C53B95"/>
+    <w:rsid w:val="00A37D5B"/>
     <w:pPr>
       <w:keepNext/>
       <w:keepLines/>
@@ -614,7 +770,7 @@
     </w:pPr>
     <w:rPr>
       <w:rFonts w:asciiTheme="majorHAnsi" w:eastAsiaTheme="majorEastAsia" w:hAnsiTheme="majorHAnsi" w:cstheme="majorBidi"/>
-      <w:color w:val="2F5496" w:themeColor="accent1" w:themeShade="BF"/>
+      <w:color w:val="0F4761" w:themeColor="accent1" w:themeShade="BF"/>
       <w:sz w:val="32"/>
       <w:szCs w:val="32"/>
     </w:rPr>
@@ -628,7 +784,7 @@
     <w:semiHidden/>
     <w:unhideWhenUsed/>
     <w:qFormat/>
-    <w:rsid w:val="00C53B95"/>
+    <w:rsid w:val="00A37D5B"/>
     <w:pPr>
       <w:keepNext/>
       <w:keepLines/>
@@ -637,7 +793,7 @@
     </w:pPr>
     <w:rPr>
       <w:rFonts w:eastAsiaTheme="majorEastAsia" w:cstheme="majorBidi"/>
-      <w:color w:val="2F5496" w:themeColor="accent1" w:themeShade="BF"/>
+      <w:color w:val="0F4761" w:themeColor="accent1" w:themeShade="BF"/>
       <w:sz w:val="28"/>
       <w:szCs w:val="28"/>
     </w:rPr>
@@ -651,7 +807,7 @@
     <w:semiHidden/>
     <w:unhideWhenUsed/>
     <w:qFormat/>
-    <w:rsid w:val="00C53B95"/>
+    <w:rsid w:val="00A37D5B"/>
     <w:pPr>
       <w:keepNext/>
       <w:keepLines/>
@@ -662,7 +818,7 @@
       <w:rFonts w:eastAsiaTheme="majorEastAsia" w:cstheme="majorBidi"/>
       <w:i/>
       <w:iCs/>
-      <w:color w:val="2F5496" w:themeColor="accent1" w:themeShade="BF"/>
+      <w:color w:val="0F4761" w:themeColor="accent1" w:themeShade="BF"/>
     </w:rPr>
   </w:style>
   <w:style w:type="paragraph" w:styleId="Heading5">
@@ -674,7 +830,7 @@
     <w:semiHidden/>
     <w:unhideWhenUsed/>
     <w:qFormat/>
-    <w:rsid w:val="00C53B95"/>
+    <w:rsid w:val="00A37D5B"/>
     <w:pPr>
       <w:keepNext/>
       <w:keepLines/>
@@ -683,7 +839,7 @@
     </w:pPr>
     <w:rPr>
       <w:rFonts w:eastAsiaTheme="majorEastAsia" w:cstheme="majorBidi"/>
-      <w:color w:val="2F5496" w:themeColor="accent1" w:themeShade="BF"/>
+      <w:color w:val="0F4761" w:themeColor="accent1" w:themeShade="BF"/>
     </w:rPr>
   </w:style>
   <w:style w:type="paragraph" w:styleId="Heading6">
@@ -695,7 +851,7 @@
     <w:semiHidden/>
     <w:unhideWhenUsed/>
     <w:qFormat/>
-    <w:rsid w:val="00C53B95"/>
+    <w:rsid w:val="00A37D5B"/>
     <w:pPr>
       <w:keepNext/>
       <w:keepLines/>
@@ -718,7 +874,7 @@
     <w:semiHidden/>
     <w:unhideWhenUsed/>
     <w:qFormat/>
-    <w:rsid w:val="00C53B95"/>
+    <w:rsid w:val="00A37D5B"/>
     <w:pPr>
       <w:keepNext/>
       <w:keepLines/>
@@ -739,7 +895,7 @@
     <w:semiHidden/>
     <w:unhideWhenUsed/>
     <w:qFormat/>
-    <w:rsid w:val="00C53B95"/>
+    <w:rsid w:val="00A37D5B"/>
     <w:pPr>
       <w:keepNext/>
       <w:keepLines/>
@@ -762,7 +918,7 @@
     <w:semiHidden/>
     <w:unhideWhenUsed/>
     <w:qFormat/>
-    <w:rsid w:val="00C53B95"/>
+    <w:rsid w:val="00A37D5B"/>
     <w:pPr>
       <w:keepNext/>
       <w:keepLines/>
@@ -806,10 +962,10 @@
     <w:basedOn w:val="DefaultParagraphFont"/>
     <w:link w:val="Heading1"/>
     <w:uiPriority w:val="9"/>
-    <w:rsid w:val="00C53B95"/>
+    <w:rsid w:val="00A37D5B"/>
     <w:rPr>
       <w:rFonts w:asciiTheme="majorHAnsi" w:eastAsiaTheme="majorEastAsia" w:hAnsiTheme="majorHAnsi" w:cstheme="majorBidi"/>
-      <w:color w:val="2F5496" w:themeColor="accent1" w:themeShade="BF"/>
+      <w:color w:val="0F4761" w:themeColor="accent1" w:themeShade="BF"/>
       <w:sz w:val="40"/>
       <w:szCs w:val="40"/>
     </w:rPr>
@@ -820,10 +976,10 @@
     <w:link w:val="Heading2"/>
     <w:uiPriority w:val="9"/>
     <w:semiHidden/>
-    <w:rsid w:val="00C53B95"/>
+    <w:rsid w:val="00A37D5B"/>
     <w:rPr>
       <w:rFonts w:asciiTheme="majorHAnsi" w:eastAsiaTheme="majorEastAsia" w:hAnsiTheme="majorHAnsi" w:cstheme="majorBidi"/>
-      <w:color w:val="2F5496" w:themeColor="accent1" w:themeShade="BF"/>
+      <w:color w:val="0F4761" w:themeColor="accent1" w:themeShade="BF"/>
       <w:sz w:val="32"/>
       <w:szCs w:val="32"/>
     </w:rPr>
@@ -834,10 +990,10 @@
     <w:link w:val="Heading3"/>
     <w:uiPriority w:val="9"/>
     <w:semiHidden/>
-    <w:rsid w:val="00C53B95"/>
+    <w:rsid w:val="00A37D5B"/>
     <w:rPr>
       <w:rFonts w:eastAsiaTheme="majorEastAsia" w:cstheme="majorBidi"/>
-      <w:color w:val="2F5496" w:themeColor="accent1" w:themeShade="BF"/>
+      <w:color w:val="0F4761" w:themeColor="accent1" w:themeShade="BF"/>
       <w:sz w:val="28"/>
       <w:szCs w:val="28"/>
     </w:rPr>
@@ -848,12 +1004,12 @@
     <w:link w:val="Heading4"/>
     <w:uiPriority w:val="9"/>
     <w:semiHidden/>
-    <w:rsid w:val="00C53B95"/>
+    <w:rsid w:val="00A37D5B"/>
     <w:rPr>
       <w:rFonts w:eastAsiaTheme="majorEastAsia" w:cstheme="majorBidi"/>
       <w:i/>
       <w:iCs/>
-      <w:color w:val="2F5496" w:themeColor="accent1" w:themeShade="BF"/>
+      <w:color w:val="0F4761" w:themeColor="accent1" w:themeShade="BF"/>
     </w:rPr>
   </w:style>
   <w:style w:type="character" w:customStyle="1" w:styleId="Heading5Char">
@@ -862,10 +1018,10 @@
     <w:link w:val="Heading5"/>
     <w:uiPriority w:val="9"/>
     <w:semiHidden/>
-    <w:rsid w:val="00C53B95"/>
+    <w:rsid w:val="00A37D5B"/>
     <w:rPr>
       <w:rFonts w:eastAsiaTheme="majorEastAsia" w:cstheme="majorBidi"/>
-      <w:color w:val="2F5496" w:themeColor="accent1" w:themeShade="BF"/>
+      <w:color w:val="0F4761" w:themeColor="accent1" w:themeShade="BF"/>
     </w:rPr>
   </w:style>
   <w:style w:type="character" w:customStyle="1" w:styleId="Heading6Char">
@@ -874,7 +1030,7 @@
     <w:link w:val="Heading6"/>
     <w:uiPriority w:val="9"/>
     <w:semiHidden/>
-    <w:rsid w:val="00C53B95"/>
+    <w:rsid w:val="00A37D5B"/>
     <w:rPr>
       <w:rFonts w:eastAsiaTheme="majorEastAsia" w:cstheme="majorBidi"/>
       <w:i/>
@@ -888,7 +1044,7 @@
     <w:link w:val="Heading7"/>
     <w:uiPriority w:val="9"/>
     <w:semiHidden/>
-    <w:rsid w:val="00C53B95"/>
+    <w:rsid w:val="00A37D5B"/>
     <w:rPr>
       <w:rFonts w:eastAsiaTheme="majorEastAsia" w:cstheme="majorBidi"/>
       <w:color w:val="595959" w:themeColor="text1" w:themeTint="A6"/>
@@ -900,7 +1056,7 @@
     <w:link w:val="Heading8"/>
     <w:uiPriority w:val="9"/>
     <w:semiHidden/>
-    <w:rsid w:val="00C53B95"/>
+    <w:rsid w:val="00A37D5B"/>
     <w:rPr>
       <w:rFonts w:eastAsiaTheme="majorEastAsia" w:cstheme="majorBidi"/>
       <w:i/>
@@ -914,7 +1070,7 @@
     <w:link w:val="Heading9"/>
     <w:uiPriority w:val="9"/>
     <w:semiHidden/>
-    <w:rsid w:val="00C53B95"/>
+    <w:rsid w:val="00A37D5B"/>
     <w:rPr>
       <w:rFonts w:eastAsiaTheme="majorEastAsia" w:cstheme="majorBidi"/>
       <w:color w:val="272727" w:themeColor="text1" w:themeTint="D8"/>
@@ -927,7 +1083,7 @@
     <w:link w:val="TitleChar"/>
     <w:uiPriority w:val="10"/>
     <w:qFormat/>
-    <w:rsid w:val="00C53B95"/>
+    <w:rsid w:val="00A37D5B"/>
     <w:pPr>
       <w:spacing w:after="80" w:line="240" w:lineRule="auto"/>
       <w:contextualSpacing/>
@@ -945,7 +1101,7 @@
     <w:basedOn w:val="DefaultParagraphFont"/>
     <w:link w:val="Title"/>
     <w:uiPriority w:val="10"/>
-    <w:rsid w:val="00C53B95"/>
+    <w:rsid w:val="00A37D5B"/>
     <w:rPr>
       <w:rFonts w:asciiTheme="majorHAnsi" w:eastAsiaTheme="majorEastAsia" w:hAnsiTheme="majorHAnsi" w:cstheme="majorBidi"/>
       <w:spacing w:val="-10"/>
@@ -961,7 +1117,7 @@
     <w:link w:val="SubtitleChar"/>
     <w:uiPriority w:val="11"/>
     <w:qFormat/>
-    <w:rsid w:val="00C53B95"/>
+    <w:rsid w:val="00A37D5B"/>
     <w:pPr>
       <w:numPr>
         <w:ilvl w:val="1"/>
@@ -980,7 +1136,7 @@
     <w:basedOn w:val="DefaultParagraphFont"/>
     <w:link w:val="Subtitle"/>
     <w:uiPriority w:val="11"/>
-    <w:rsid w:val="00C53B95"/>
+    <w:rsid w:val="00A37D5B"/>
     <w:rPr>
       <w:rFonts w:eastAsiaTheme="majorEastAsia" w:cstheme="majorBidi"/>
       <w:color w:val="595959" w:themeColor="text1" w:themeTint="A6"/>
@@ -996,7 +1152,7 @@
     <w:link w:val="QuoteChar"/>
     <w:uiPriority w:val="29"/>
     <w:qFormat/>
-    <w:rsid w:val="00C53B95"/>
+    <w:rsid w:val="00A37D5B"/>
     <w:pPr>
       <w:spacing w:before="160"/>
       <w:jc w:val="center"/>
@@ -1012,7 +1168,7 @@
     <w:basedOn w:val="DefaultParagraphFont"/>
     <w:link w:val="Quote"/>
     <w:uiPriority w:val="29"/>
-    <w:rsid w:val="00C53B95"/>
+    <w:rsid w:val="00A37D5B"/>
     <w:rPr>
       <w:i/>
       <w:iCs/>
@@ -1024,7 +1180,7 @@
     <w:basedOn w:val="Normal"/>
     <w:uiPriority w:val="34"/>
     <w:qFormat/>
-    <w:rsid w:val="00C53B95"/>
+    <w:rsid w:val="00A37D5B"/>
     <w:pPr>
       <w:ind w:left="720"/>
       <w:contextualSpacing/>
@@ -1035,11 +1191,11 @@
     <w:basedOn w:val="DefaultParagraphFont"/>
     <w:uiPriority w:val="21"/>
     <w:qFormat/>
-    <w:rsid w:val="00C53B95"/>
+    <w:rsid w:val="00A37D5B"/>
     <w:rPr>
       <w:i/>
       <w:iCs/>
-      <w:color w:val="2F5496" w:themeColor="accent1" w:themeShade="BF"/>
+      <w:color w:val="0F4761" w:themeColor="accent1" w:themeShade="BF"/>
     </w:rPr>
   </w:style>
   <w:style w:type="paragraph" w:styleId="IntenseQuote">
@@ -1049,11 +1205,11 @@
     <w:link w:val="IntenseQuoteChar"/>
     <w:uiPriority w:val="30"/>
     <w:qFormat/>
-    <w:rsid w:val="00C53B95"/>
+    <w:rsid w:val="00A37D5B"/>
     <w:pPr>
       <w:pBdr>
-        <w:top w:val="single" w:sz="4" w:space="10" w:color="2F5496" w:themeColor="accent1" w:themeShade="BF"/>
-        <w:bottom w:val="single" w:sz="4" w:space="10" w:color="2F5496" w:themeColor="accent1" w:themeShade="BF"/>
+        <w:top w:val="single" w:sz="4" w:space="10" w:color="0F4761" w:themeColor="accent1" w:themeShade="BF"/>
+        <w:bottom w:val="single" w:sz="4" w:space="10" w:color="0F4761" w:themeColor="accent1" w:themeShade="BF"/>
       </w:pBdr>
       <w:spacing w:before="360" w:after="360"/>
       <w:ind w:left="864" w:right="864"/>
@@ -1062,7 +1218,7 @@
     <w:rPr>
       <w:i/>
       <w:iCs/>
-      <w:color w:val="2F5496" w:themeColor="accent1" w:themeShade="BF"/>
+      <w:color w:val="0F4761" w:themeColor="accent1" w:themeShade="BF"/>
     </w:rPr>
   </w:style>
   <w:style w:type="character" w:customStyle="1" w:styleId="IntenseQuoteChar">
@@ -1070,11 +1226,11 @@
     <w:basedOn w:val="DefaultParagraphFont"/>
     <w:link w:val="IntenseQuote"/>
     <w:uiPriority w:val="30"/>
-    <w:rsid w:val="00C53B95"/>
+    <w:rsid w:val="00A37D5B"/>
     <w:rPr>
       <w:i/>
       <w:iCs/>
-      <w:color w:val="2F5496" w:themeColor="accent1" w:themeShade="BF"/>
+      <w:color w:val="0F4761" w:themeColor="accent1" w:themeShade="BF"/>
     </w:rPr>
   </w:style>
   <w:style w:type="character" w:styleId="IntenseReference">
@@ -1082,33 +1238,14 @@
     <w:basedOn w:val="DefaultParagraphFont"/>
     <w:uiPriority w:val="32"/>
     <w:qFormat/>
-    <w:rsid w:val="00C53B95"/>
+    <w:rsid w:val="00A37D5B"/>
     <w:rPr>
       <w:b/>
       <w:bCs/>
       <w:smallCaps/>
-      <w:color w:val="2F5496" w:themeColor="accent1" w:themeShade="BF"/>
+      <w:color w:val="0F4761" w:themeColor="accent1" w:themeShade="BF"/>
       <w:spacing w:val="5"/>
     </w:rPr>
-  </w:style>
-  <w:style w:type="table" w:styleId="TableGrid">
-    <w:name w:val="Table Grid"/>
-    <w:basedOn w:val="TableNormal"/>
-    <w:uiPriority w:val="39"/>
-    <w:rsid w:val="00677CAD"/>
-    <w:pPr>
-      <w:spacing w:after="0" w:line="240" w:lineRule="auto"/>
-    </w:pPr>
-    <w:tblPr>
-      <w:tblBorders>
-        <w:top w:val="single" w:sz="4" w:space="0" w:color="auto"/>
-        <w:left w:val="single" w:sz="4" w:space="0" w:color="auto"/>
-        <w:bottom w:val="single" w:sz="4" w:space="0" w:color="auto"/>
-        <w:right w:val="single" w:sz="4" w:space="0" w:color="auto"/>
-        <w:insideH w:val="single" w:sz="4" w:space="0" w:color="auto"/>
-        <w:insideV w:val="single" w:sz="4" w:space="0" w:color="auto"/>
-      </w:tblBorders>
-    </w:tblPr>
   </w:style>
 </w:styles>
 </file>
@@ -1124,39 +1261,39 @@
         <a:sysClr val="window" lastClr="FFFFFF"/>
       </a:lt1>
       <a:dk2>
-        <a:srgbClr val="44546A"/>
+        <a:srgbClr val="0E2841"/>
       </a:dk2>
       <a:lt2>
-        <a:srgbClr val="E7E6E6"/>
+        <a:srgbClr val="E8E8E8"/>
       </a:lt2>
       <a:accent1>
-        <a:srgbClr val="4472C4"/>
+        <a:srgbClr val="156082"/>
       </a:accent1>
       <a:accent2>
-        <a:srgbClr val="ED7D31"/>
+        <a:srgbClr val="E97132"/>
       </a:accent2>
       <a:accent3>
-        <a:srgbClr val="A5A5A5"/>
+        <a:srgbClr val="196B24"/>
       </a:accent3>
       <a:accent4>
-        <a:srgbClr val="FFC000"/>
+        <a:srgbClr val="0F9ED5"/>
       </a:accent4>
       <a:accent5>
-        <a:srgbClr val="5B9BD5"/>
+        <a:srgbClr val="A02B93"/>
       </a:accent5>
       <a:accent6>
-        <a:srgbClr val="70AD47"/>
+        <a:srgbClr val="4EA72E"/>
       </a:accent6>
       <a:hlink>
-        <a:srgbClr val="0563C1"/>
+        <a:srgbClr val="467886"/>
       </a:hlink>
       <a:folHlink>
-        <a:srgbClr val="954F72"/>
+        <a:srgbClr val="96607D"/>
       </a:folHlink>
     </a:clrScheme>
     <a:fontScheme name="Office">
       <a:majorFont>
-        <a:latin typeface="Calibri Light" panose="020F0302020204030204"/>
+        <a:latin typeface="Aptos Display" panose="02110004020202020204"/>
         <a:ea typeface=""/>
         <a:cs typeface=""/>
         <a:font script="Jpan" typeface="游ゴシック Light"/>
@@ -1208,10 +1345,10 @@
         <a:font script="Tfng" typeface="Ebrima"/>
       </a:majorFont>
       <a:minorFont>
-        <a:latin typeface="Calibri" panose="020F0502020204030204"/>
+        <a:latin typeface="Aptos" panose="02110004020202020204"/>
         <a:ea typeface=""/>
         <a:cs typeface=""/>
-        <a:font script="Jpan" typeface="游明朝"/>
+        <a:font script="Jpan" typeface="游ゴシック"/>
         <a:font script="Hang" typeface="맑은 고딕"/>
         <a:font script="Hans" typeface="等线"/>
         <a:font script="Hant" typeface="新細明體"/>

</xml_diff>